<commit_message>
Document the Docker Desktop provisioning failure
Installing Docker Desktop is not the same as provisioning it, and the gap
produces a confusing failure: sam build reports "requires a container runtime"
while Docker Desktop says only "unable to start" and writes no log at all.

The actual diagnostic is `wsl -l -v` - a missing docker-desktop distribution
means first-run setup never completed, which needs one elevated launch. Adds
the clear-the-stalled-processes step first, since repeated launch attempts
stack up and block each other.
</commit_message>
<xml_diff>
--- a/docs/Spatial-Math-AWS-Setup-Guide.docx
+++ b/docs/Spatial-Math-AWS-Setup-Guide.docx
@@ -2071,6 +2071,465 @@
         <w:t xml:space="preserve">python --version &amp;&amp; aws --version &amp;&amp; sam --version &amp;&amp; docker --version</w:t>
       </w:r>
     </w:p>
+    <w:p>
+      <w:pPr>
+        <w:spacing w:after="120" w:line="276"/>
+      </w:pPr>
+      <w:r>
+        <w:rPr>
+          <w:rFonts w:ascii="Calibri" w:cs="Calibri" w:eastAsia="Calibri" w:hAnsi="Calibri"/>
+          <w:b w:val="false"/>
+          <w:bCs w:val="false"/>
+          <w:i w:val="false"/>
+          <w:iCs w:val="false"/>
+          <w:color w:val="242A31"/>
+          <w:sz w:val="22"/>
+          <w:szCs w:val="22"/>
+        </w:rPr>
+        <w:t xml:space="preserve">That last one only proves the Docker CLI is installed, not that the engine is running. The real check is </w:t>
+      </w:r>
+      <w:r>
+        <w:rPr>
+          <w:rFonts w:ascii="Consolas" w:cs="Consolas" w:eastAsia="Consolas" w:hAnsi="Consolas"/>
+          <w:b w:val="false"/>
+          <w:bCs w:val="false"/>
+          <w:i w:val="false"/>
+          <w:iCs w:val="false"/>
+          <w:color w:val="242A31"/>
+          <w:sz w:val="22"/>
+          <w:szCs w:val="22"/>
+          <w:shd w:fill="F3F5F7" w:val="clear"/>
+        </w:rPr>
+        <w:t xml:space="preserve">docker info</w:t>
+      </w:r>
+      <w:r>
+        <w:rPr>
+          <w:rFonts w:ascii="Calibri" w:cs="Calibri" w:eastAsia="Calibri" w:hAnsi="Calibri"/>
+          <w:b w:val="false"/>
+          <w:bCs w:val="false"/>
+          <w:i w:val="false"/>
+          <w:iCs w:val="false"/>
+          <w:color w:val="242A31"/>
+          <w:sz w:val="22"/>
+          <w:szCs w:val="22"/>
+        </w:rPr>
+        <w:t xml:space="preserve">.</w:t>
+      </w:r>
+    </w:p>
+    <w:p>
+      <w:pPr>
+        <w:pStyle w:val="Heading2"/>
+        <w:spacing w:after="90" w:before="260"/>
+      </w:pPr>
+      <w:r>
+        <w:rPr>
+          <w:rFonts w:ascii="Calibri" w:cs="Calibri" w:eastAsia="Calibri" w:hAnsi="Calibri"/>
+          <w:b/>
+          <w:bCs/>
+          <w:color w:val="1A2332"/>
+          <w:sz w:val="24"/>
+          <w:szCs w:val="24"/>
+        </w:rPr>
+        <w:t xml:space="preserve">If Docker will not start</w:t>
+      </w:r>
+    </w:p>
+    <w:p>
+      <w:pPr>
+        <w:spacing w:after="120" w:line="276"/>
+      </w:pPr>
+      <w:r>
+        <w:rPr>
+          <w:rFonts w:ascii="Calibri" w:cs="Calibri" w:eastAsia="Calibri" w:hAnsi="Calibri"/>
+          <w:b w:val="false"/>
+          <w:bCs w:val="false"/>
+          <w:i w:val="false"/>
+          <w:iCs w:val="false"/>
+          <w:color w:val="242A31"/>
+          <w:sz w:val="22"/>
+          <w:szCs w:val="22"/>
+        </w:rPr>
+        <w:t xml:space="preserve">Installing Docker Desktop is not the same as provisioning it, and the gap between the two produces a confusing failure: sam build reports "requires a container runtime", and Docker Desktop says only "Docker Desktop is unable to start", with no log file written at all.</w:t>
+      </w:r>
+    </w:p>
+    <w:p>
+      <w:pPr>
+        <w:spacing w:after="120" w:line="276"/>
+      </w:pPr>
+      <w:r>
+        <w:rPr>
+          <w:rFonts w:ascii="Calibri" w:cs="Calibri" w:eastAsia="Calibri" w:hAnsi="Calibri"/>
+          <w:b w:val="false"/>
+          <w:bCs w:val="false"/>
+          <w:i w:val="false"/>
+          <w:iCs w:val="false"/>
+          <w:color w:val="242A31"/>
+          <w:sz w:val="22"/>
+          <w:szCs w:val="22"/>
+        </w:rPr>
+        <w:t xml:space="preserve">The diagnostic that actually tells you what is wrong:</w:t>
+      </w:r>
+    </w:p>
+    <w:p>
+      <w:pPr>
+        <w:shd w:fill="F3F5F7" w:val="clear"/>
+        <w:spacing w:after="160" w:before="100" w:line="260"/>
+        <w:ind w:left="300"/>
+      </w:pPr>
+      <w:r>
+        <w:rPr>
+          <w:rFonts w:ascii="Consolas" w:cs="Consolas" w:eastAsia="Consolas" w:hAnsi="Consolas"/>
+          <w:color w:val="1C2733"/>
+          <w:sz w:val="19"/>
+          <w:szCs w:val="19"/>
+        </w:rPr>
+        <w:t xml:space="preserve">wsl -l -v</w:t>
+      </w:r>
+    </w:p>
+    <w:p>
+      <w:pPr>
+        <w:spacing w:after="120" w:line="276"/>
+      </w:pPr>
+      <w:r>
+        <w:rPr>
+          <w:rFonts w:ascii="Calibri" w:cs="Calibri" w:eastAsia="Calibri" w:hAnsi="Calibri"/>
+          <w:b w:val="false"/>
+          <w:bCs w:val="false"/>
+          <w:i w:val="false"/>
+          <w:iCs w:val="false"/>
+          <w:color w:val="242A31"/>
+          <w:sz w:val="22"/>
+          <w:szCs w:val="22"/>
+        </w:rPr>
+        <w:t xml:space="preserve">You should see </w:t>
+      </w:r>
+      <w:r>
+        <w:rPr>
+          <w:rFonts w:ascii="Calibri" w:cs="Calibri" w:eastAsia="Calibri" w:hAnsi="Calibri"/>
+          <w:b/>
+          <w:bCs/>
+          <w:i w:val="false"/>
+          <w:iCs w:val="false"/>
+          <w:color w:val="242A31"/>
+          <w:sz w:val="22"/>
+          <w:szCs w:val="22"/>
+        </w:rPr>
+        <w:t xml:space="preserve">two</w:t>
+      </w:r>
+      <w:r>
+        <w:rPr>
+          <w:rFonts w:ascii="Calibri" w:cs="Calibri" w:eastAsia="Calibri" w:hAnsi="Calibri"/>
+          <w:b w:val="false"/>
+          <w:bCs w:val="false"/>
+          <w:i w:val="false"/>
+          <w:iCs w:val="false"/>
+          <w:color w:val="242A31"/>
+          <w:sz w:val="22"/>
+          <w:szCs w:val="22"/>
+        </w:rPr>
+        <w:t xml:space="preserve"> distributions — your Linux distro and docker-desktop. If docker-desktop is missing, Docker has never completed its first-run setup, which needs administrator rights. The symptoms line up: no log file, and a pile of stalled Docker Desktop processes from repeated launch attempts.</w:t>
+      </w:r>
+    </w:p>
+    <w:p>
+      <w:pPr>
+        <w:spacing w:after="40"/>
+      </w:pPr>
+    </w:p>
+    <w:p>
+      <w:pPr>
+        <w:tabs>
+          <w:tab w:val="left" w:pos="400"/>
+        </w:tabs>
+        <w:spacing w:after="40" w:line="276"/>
+        <w:ind w:left="400" w:hanging="400"/>
+      </w:pPr>
+      <w:r>
+        <w:rPr>
+          <w:rFonts w:ascii="Segoe UI Symbol" w:cs="Segoe UI Symbol" w:eastAsia="Segoe UI Symbol" w:hAnsi="Segoe UI Symbol"/>
+          <w:color w:val="B0770A"/>
+          <w:sz w:val="26"/>
+          <w:szCs w:val="26"/>
+        </w:rPr>
+        <w:t xml:space="preserve">☐</w:t>
+      </w:r>
+      <w:r>
+        <w:rPr>
+          <w:sz w:val="22"/>
+          <w:szCs w:val="22"/>
+        </w:rPr>
+        <w:t xml:space="preserve">	</w:t>
+      </w:r>
+      <w:r>
+        <w:rPr>
+          <w:rFonts w:ascii="Calibri" w:cs="Calibri" w:eastAsia="Calibri" w:hAnsi="Calibri"/>
+          <w:color w:val="242A31"/>
+          <w:sz w:val="22"/>
+          <w:szCs w:val="22"/>
+        </w:rPr>
+        <w:t xml:space="preserve">Clear the jam — repeated launches leave processes stacked up, blocking each other:</w:t>
+      </w:r>
+    </w:p>
+    <w:p>
+      <w:pPr>
+        <w:shd w:fill="F3F5F7" w:val="clear"/>
+        <w:spacing w:after="0" w:before="100" w:line="260"/>
+        <w:ind w:left="300"/>
+      </w:pPr>
+      <w:r>
+        <w:rPr>
+          <w:rFonts w:ascii="Consolas" w:cs="Consolas" w:eastAsia="Consolas" w:hAnsi="Consolas"/>
+          <w:color w:val="1C2733"/>
+          <w:sz w:val="19"/>
+          <w:szCs w:val="19"/>
+        </w:rPr>
+        <w:t xml:space="preserve">Get-Process -Name '*docker*' -ErrorAction SilentlyContinue | Stop-Process -Force</w:t>
+      </w:r>
+    </w:p>
+    <w:p>
+      <w:pPr>
+        <w:shd w:fill="F3F5F7" w:val="clear"/>
+        <w:spacing w:after="160" w:before="0" w:line="260"/>
+        <w:ind w:left="300"/>
+      </w:pPr>
+      <w:r>
+        <w:rPr>
+          <w:rFonts w:ascii="Consolas" w:cs="Consolas" w:eastAsia="Consolas" w:hAnsi="Consolas"/>
+          <w:color w:val="1C2733"/>
+          <w:sz w:val="19"/>
+          <w:szCs w:val="19"/>
+        </w:rPr>
+        <w:t xml:space="preserve">wsl --shutdown</w:t>
+      </w:r>
+    </w:p>
+    <w:p>
+      <w:pPr>
+        <w:tabs>
+          <w:tab w:val="left" w:pos="400"/>
+        </w:tabs>
+        <w:spacing w:after="110" w:line="276"/>
+        <w:ind w:left="400" w:hanging="400"/>
+      </w:pPr>
+      <w:r>
+        <w:rPr>
+          <w:rFonts w:ascii="Segoe UI Symbol" w:cs="Segoe UI Symbol" w:eastAsia="Segoe UI Symbol" w:hAnsi="Segoe UI Symbol"/>
+          <w:color w:val="B0770A"/>
+          <w:sz w:val="26"/>
+          <w:szCs w:val="26"/>
+        </w:rPr>
+        <w:t xml:space="preserve">☐</w:t>
+      </w:r>
+      <w:r>
+        <w:rPr>
+          <w:sz w:val="22"/>
+          <w:szCs w:val="22"/>
+        </w:rPr>
+        <w:t xml:space="preserve">	</w:t>
+      </w:r>
+      <w:r>
+        <w:rPr>
+          <w:rFonts w:ascii="Calibri" w:cs="Calibri" w:eastAsia="Calibri" w:hAnsi="Calibri"/>
+          <w:color w:val="242A31"/>
+          <w:sz w:val="22"/>
+          <w:szCs w:val="22"/>
+        </w:rPr>
+        <w:t xml:space="preserve">Launch once, elevated: Start menu → right-click Docker Desktop → Run as administrator. This is the step that creates the docker-desktop distro.</w:t>
+      </w:r>
+    </w:p>
+    <w:p>
+      <w:pPr>
+        <w:tabs>
+          <w:tab w:val="left" w:pos="400"/>
+        </w:tabs>
+        <w:spacing w:after="110" w:line="276"/>
+        <w:ind w:left="400" w:hanging="400"/>
+      </w:pPr>
+      <w:r>
+        <w:rPr>
+          <w:rFonts w:ascii="Segoe UI Symbol" w:cs="Segoe UI Symbol" w:eastAsia="Segoe UI Symbol" w:hAnsi="Segoe UI Symbol"/>
+          <w:color w:val="B0770A"/>
+          <w:sz w:val="26"/>
+          <w:szCs w:val="26"/>
+        </w:rPr>
+        <w:t xml:space="preserve">☐</w:t>
+      </w:r>
+      <w:r>
+        <w:rPr>
+          <w:sz w:val="22"/>
+          <w:szCs w:val="22"/>
+        </w:rPr>
+        <w:t xml:space="preserve">	</w:t>
+      </w:r>
+      <w:r>
+        <w:rPr>
+          <w:rFonts w:ascii="Calibri" w:cs="Calibri" w:eastAsia="Calibri" w:hAnsi="Calibri"/>
+          <w:color w:val="242A31"/>
+          <w:sz w:val="22"/>
+          <w:szCs w:val="22"/>
+        </w:rPr>
+        <w:t xml:space="preserve">Leave it alone for three to five minutes. It is building that distro from scratch. Clicking again just recreates the pile-up.</w:t>
+      </w:r>
+    </w:p>
+    <w:p>
+      <w:pPr>
+        <w:tabs>
+          <w:tab w:val="left" w:pos="400"/>
+        </w:tabs>
+        <w:spacing w:after="110" w:line="276"/>
+        <w:ind w:left="400" w:hanging="400"/>
+      </w:pPr>
+      <w:r>
+        <w:rPr>
+          <w:rFonts w:ascii="Segoe UI Symbol" w:cs="Segoe UI Symbol" w:eastAsia="Segoe UI Symbol" w:hAnsi="Segoe UI Symbol"/>
+          <w:color w:val="B0770A"/>
+          <w:sz w:val="26"/>
+          <w:szCs w:val="26"/>
+        </w:rPr>
+        <w:t xml:space="preserve">☐</w:t>
+      </w:r>
+      <w:r>
+        <w:rPr>
+          <w:sz w:val="22"/>
+          <w:szCs w:val="22"/>
+        </w:rPr>
+        <w:t xml:space="preserve">	</w:t>
+      </w:r>
+      <w:r>
+        <w:rPr>
+          <w:rFonts w:ascii="Calibri" w:cs="Calibri" w:eastAsia="Calibri" w:hAnsi="Calibri"/>
+          <w:color w:val="242A31"/>
+          <w:sz w:val="22"/>
+          <w:szCs w:val="22"/>
+        </w:rPr>
+        <w:t xml:space="preserve">Confirm with wsl -l -v that docker-desktop now exists, then run docker info.</w:t>
+      </w:r>
+    </w:p>
+    <w:p>
+      <w:pPr>
+        <w:spacing w:after="40"/>
+      </w:pPr>
+    </w:p>
+    <w:tbl>
+      <w:tblPr>
+        <w:tblW w:type="dxa" w:w="9792"/>
+        <w:tblBorders>
+          <w:top w:val="none" w:color="FFFFFF" w:sz="0"/>
+          <w:left w:val="none" w:color="FFFFFF" w:sz="0"/>
+          <w:bottom w:val="none" w:color="FFFFFF" w:sz="0"/>
+          <w:right w:val="none" w:color="FFFFFF" w:sz="0"/>
+          <w:insideH w:val="single" w:color="auto" w:sz="4"/>
+          <w:insideV w:val="single" w:color="auto" w:sz="4"/>
+        </w:tblBorders>
+      </w:tblPr>
+      <w:tblGrid>
+        <w:gridCol w:w="9792"/>
+      </w:tblGrid>
+      <w:tr>
+        <w:tc>
+          <w:tcPr>
+            <w:tcW w:type="dxa" w:w="9792"/>
+            <w:tcBorders>
+              <w:top w:val="none" w:color="FFFFFF" w:sz="0"/>
+              <w:left w:val="single" w:color="D9A407" w:sz="18"/>
+              <w:bottom w:val="none" w:color="FFFFFF" w:sz="0"/>
+              <w:right w:val="none" w:color="FFFFFF" w:sz="0"/>
+            </w:tcBorders>
+            <w:shd w:fill="FFF7E3" w:val="clear"/>
+            <w:tcMar>
+              <w:top w:type="dxa" w:w="130"/>
+              <w:left w:type="dxa" w:w="200"/>
+              <w:bottom w:type="dxa" w:w="130"/>
+              <w:right w:type="dxa" w:w="200"/>
+            </w:tcMar>
+          </w:tcPr>
+          <w:p>
+            <w:pPr>
+              <w:spacing w:after="60"/>
+            </w:pPr>
+            <w:r>
+              <w:rPr>
+                <w:rFonts w:ascii="Calibri" w:cs="Calibri" w:eastAsia="Calibri" w:hAnsi="Calibri"/>
+                <w:b/>
+                <w:bCs/>
+                <w:color w:val="D9A407"/>
+                <w:spacing w:val="30"/>
+                <w:sz w:val="17"/>
+                <w:szCs w:val="17"/>
+              </w:rPr>
+              <w:t xml:space="preserve">RULE THESE OUT FIRST</w:t>
+            </w:r>
+          </w:p>
+          <w:p>
+            <w:pPr>
+              <w:spacing w:after="0" w:line="268"/>
+            </w:pPr>
+            <w:r>
+              <w:rPr>
+                <w:rFonts w:ascii="Calibri" w:cs="Calibri" w:eastAsia="Calibri" w:hAnsi="Calibri"/>
+                <w:b w:val="false"/>
+                <w:bCs w:val="false"/>
+                <w:i w:val="false"/>
+                <w:iCs w:val="false"/>
+                <w:color w:val="2A2F35"/>
+                <w:sz w:val="21"/>
+                <w:szCs w:val="21"/>
+              </w:rPr>
+              <w:t xml:space="preserve">Both are silent failures. Virtualisation must be enabled in firmware, and WSL 2 must be present: </w:t>
+            </w:r>
+            <w:r>
+              <w:rPr>
+                <w:rFonts w:ascii="Consolas" w:cs="Consolas" w:eastAsia="Consolas" w:hAnsi="Consolas"/>
+                <w:b w:val="false"/>
+                <w:bCs w:val="false"/>
+                <w:i w:val="false"/>
+                <w:iCs w:val="false"/>
+                <w:color w:val="2A2F35"/>
+                <w:sz w:val="21"/>
+                <w:szCs w:val="21"/>
+              </w:rPr>
+              <w:t xml:space="preserve">(Get-CimInstance Win32_ComputerSystem).HypervisorPresent</w:t>
+            </w:r>
+            <w:r>
+              <w:rPr>
+                <w:rFonts w:ascii="Calibri" w:cs="Calibri" w:eastAsia="Calibri" w:hAnsi="Calibri"/>
+                <w:b w:val="false"/>
+                <w:bCs w:val="false"/>
+                <w:i w:val="false"/>
+                <w:iCs w:val="false"/>
+                <w:color w:val="2A2F35"/>
+                <w:sz w:val="21"/>
+                <w:szCs w:val="21"/>
+              </w:rPr>
+              <w:t xml:space="preserve"> must return True, and </w:t>
+            </w:r>
+            <w:r>
+              <w:rPr>
+                <w:rFonts w:ascii="Consolas" w:cs="Consolas" w:eastAsia="Consolas" w:hAnsi="Consolas"/>
+                <w:b w:val="false"/>
+                <w:bCs w:val="false"/>
+                <w:i w:val="false"/>
+                <w:iCs w:val="false"/>
+                <w:color w:val="2A2F35"/>
+                <w:sz w:val="21"/>
+                <w:szCs w:val="21"/>
+              </w:rPr>
+              <w:t xml:space="preserve">wsl --version</w:t>
+            </w:r>
+            <w:r>
+              <w:rPr>
+                <w:rFonts w:ascii="Calibri" w:cs="Calibri" w:eastAsia="Calibri" w:hAnsi="Calibri"/>
+                <w:b w:val="false"/>
+                <w:bCs w:val="false"/>
+                <w:i w:val="false"/>
+                <w:iCs w:val="false"/>
+                <w:color w:val="2A2F35"/>
+                <w:sz w:val="21"/>
+                <w:szCs w:val="21"/>
+              </w:rPr>
+              <w:t xml:space="preserve"> must report version 2. If neither is the problem, Settings → Troubleshoot → Reset to factory defaults reruns provisioning from scratch.</w:t>
+            </w:r>
+          </w:p>
+        </w:tc>
+      </w:tr>
+    </w:tbl>
     <w:p>
       <w:pPr>
         <w:pStyle w:val="Heading2"/>

</xml_diff>